<commit_message>
docs: reference list to no. 16 + add access links and page slots
Trim list to sources 1-16 (next chapter continues from 17). Add
'Dostupné z:' link to every entry (DOI/JSTOR/SSRN/Google Books) and a
page slot for non-article sources (Zarattini, Aronson, Pardo,
Efron & Tibshirani).

Co-Authored-By: Claude Opus 4.8 <noreply@anthropic.com>
Claude-Session: https://claude.ai/code/session_013r7ovPSZArf9XucUhV1eXv
</commit_message>
<xml_diff>
--- a/docs/Seznam_zdroju.docx
+++ b/docs/Seznam_zdroju.docx
@@ -62,7 +62,7 @@
           <w:sz w:val="24"/>
           <w:szCs w:val="24"/>
         </w:rPr>
-        <w:t xml:space="preserve"> [online]. SSRN Working Paper No. 4631351, 2023 [cit. 2026-07-22]. Dostupné z: https://papers.ssrn.com/sol3/papers.cfm?abstract_id=4631351</w:t>
+        <w:t xml:space="preserve"> [online]. SSRN Working Paper No. 4631351, 2023, s. [doplň stranu] [cit. 2026-07-22]. Dostupné z: https://papers.ssrn.com/sol3/papers.cfm?abstract_id=4631351</w:t>
       </w:r>
     </w:p>
     <w:p>
@@ -110,7 +110,7 @@
           <w:sz w:val="24"/>
           <w:szCs w:val="24"/>
         </w:rPr>
-        <w:t xml:space="preserve">. Hoboken (NJ): John Wiley &amp; Sons, 2007. ISBN 978-0-470-00874-4.</w:t>
+        <w:t xml:space="preserve">. Hoboken (NJ): John Wiley &amp; Sons, 2007, s. [doplň stranu]. ISBN 978-0-470-00874-4. Dostupné z: https://books.google.com/books?isbn=9780470008744</w:t>
       </w:r>
     </w:p>
     <w:p>
@@ -158,7 +158,7 @@
           <w:sz w:val="24"/>
           <w:szCs w:val="24"/>
         </w:rPr>
-        <w:t xml:space="preserve">. 1988, roč. 43, č. 1, s. 97–112. ISSN 0022-1082.</w:t>
+        <w:t xml:space="preserve">. 1988, roč. 43, č. 1, s. 97–112. ISSN 0022-1082. Dostupné z: https://doi.org/10.1111/j.1540-6261.1988.tb02591.x</w:t>
       </w:r>
     </w:p>
     <w:p>
@@ -206,7 +206,7 @@
           <w:sz w:val="24"/>
           <w:szCs w:val="24"/>
         </w:rPr>
-        <w:t xml:space="preserve">. 1993, roč. 48, č. 1, s. 65–91. ISSN 0022-1082.</w:t>
+        <w:t xml:space="preserve">. 1993, roč. 48, č. 1, s. 65–91. ISSN 0022-1082. Dostupné z: https://doi.org/10.1111/j.1540-6261.1993.tb04702.x</w:t>
       </w:r>
     </w:p>
     <w:p>
@@ -254,7 +254,7 @@
           <w:sz w:val="24"/>
           <w:szCs w:val="24"/>
         </w:rPr>
-        <w:t xml:space="preserve">. 2012, roč. 104, č. 2, s. 228–250. ISSN 0304-405X.</w:t>
+        <w:t xml:space="preserve">. 2012, roč. 104, č. 2, s. 228–250. ISSN 0304-405X. Dostupné z: https://doi.org/10.1016/j.jfineco.2011.11.003</w:t>
       </w:r>
     </w:p>
     <w:p>
@@ -302,7 +302,7 @@
           <w:sz w:val="24"/>
           <w:szCs w:val="24"/>
         </w:rPr>
-        <w:t xml:space="preserve">. 1970, roč. 25, č. 2, s. 383–417. ISSN 0022-1082.</w:t>
+        <w:t xml:space="preserve">. 1970, roč. 25, č. 2, s. 383–417. ISSN 0022-1082. Dostupné z: https://doi.org/10.2307/2325486</w:t>
       </w:r>
     </w:p>
     <w:p>
@@ -350,7 +350,7 @@
           <w:sz w:val="24"/>
           <w:szCs w:val="24"/>
         </w:rPr>
-        <w:t xml:space="preserve">. 1980, roč. 70, č. 3, s. 393–408. ISSN 0002-8282.</w:t>
+        <w:t xml:space="preserve">. 1980, roč. 70, č. 3, s. 393–408. ISSN 0002-8282. Dostupné z: https://www.jstor.org/stable/1805228</w:t>
       </w:r>
     </w:p>
     <w:p>
@@ -398,7 +398,7 @@
           <w:sz w:val="24"/>
           <w:szCs w:val="24"/>
         </w:rPr>
-        <w:t xml:space="preserve">. 2004, roč. 30, č. 5, s. 15–29. ISSN 0095-4918.</w:t>
+        <w:t xml:space="preserve">. 2004, roč. 30, č. 5, s. 15–29. ISSN 0095-4918. Dostupné z: https://doi.org/10.3905/jpm.2004.442611</w:t>
       </w:r>
     </w:p>
     <w:p>
@@ -446,7 +446,7 @@
           <w:sz w:val="24"/>
           <w:szCs w:val="24"/>
         </w:rPr>
-        <w:t xml:space="preserve">. 2014, roč. 61, č. 5, s. 458–471. ISSN 0002-9920.</w:t>
+        <w:t xml:space="preserve">. 2014, roč. 61, č. 5, s. 458–471. ISSN 0002-9920. Dostupné z: https://doi.org/10.1090/noti1105</w:t>
       </w:r>
     </w:p>
     <w:p>
@@ -494,7 +494,7 @@
           <w:sz w:val="24"/>
           <w:szCs w:val="24"/>
         </w:rPr>
-        <w:t xml:space="preserve">. 2016, roč. 29, č. 1, s. 5–68. ISSN 0893-9454.</w:t>
+        <w:t xml:space="preserve">. 2016, roč. 29, č. 1, s. 5–68. ISSN 0893-9454. Dostupné z: https://doi.org/10.1093/rfs/hhv059</w:t>
       </w:r>
     </w:p>
     <w:p>
@@ -542,7 +542,7 @@
           <w:sz w:val="24"/>
           <w:szCs w:val="24"/>
         </w:rPr>
-        <w:t xml:space="preserve">. 2. vyd. Hoboken (NJ): John Wiley &amp; Sons, 2008. ISBN 978-0-470-12801-5.</w:t>
+        <w:t xml:space="preserve">. 2. vyd. Hoboken (NJ): John Wiley &amp; Sons, 2008, s. [doplň stranu]. ISBN 978-0-470-12801-5. Dostupné z: https://books.google.com/books?isbn=9780470128015</w:t>
       </w:r>
     </w:p>
     <w:p>
@@ -590,7 +590,7 @@
           <w:sz w:val="24"/>
           <w:szCs w:val="24"/>
         </w:rPr>
-        <w:t xml:space="preserve">. 1979, roč. 7, č. 1, s. 1–26. ISSN 0090-5364.</w:t>
+        <w:t xml:space="preserve">. 1979, roč. 7, č. 1, s. 1–26. ISSN 0090-5364. Dostupné z: https://doi.org/10.1214/aos/1176344552</w:t>
       </w:r>
     </w:p>
     <w:p>
@@ -638,7 +638,7 @@
           <w:sz w:val="24"/>
           <w:szCs w:val="24"/>
         </w:rPr>
-        <w:t xml:space="preserve">. 1966, roč. 39, č. 1, s. 119–138. ISSN 0021-9398.</w:t>
+        <w:t xml:space="preserve">. 1966, roč. 39, č. 1, s. 119–138. ISSN 0021-9398. Dostupné z: https://doi.org/10.1086/294846</w:t>
       </w:r>
     </w:p>
     <w:p>
@@ -686,7 +686,7 @@
           <w:sz w:val="24"/>
           <w:szCs w:val="24"/>
         </w:rPr>
-        <w:t xml:space="preserve">. New York: Chapman &amp; Hall, 1993. ISBN 978-0-412-04231-7.</w:t>
+        <w:t xml:space="preserve">. New York: Chapman &amp; Hall, 1993, s. [doplň stranu]. ISBN 978-0-412-04231-7. Dostupné z: https://books.google.com/books?isbn=9780412042317</w:t>
       </w:r>
     </w:p>
     <w:p>
@@ -734,7 +734,7 @@
           <w:sz w:val="24"/>
           <w:szCs w:val="24"/>
         </w:rPr>
-        <w:t xml:space="preserve">. 1949, roč. 44, č. 247, s. 335–341. ISSN 0162-1459.</w:t>
+        <w:t xml:space="preserve">. 1949, roč. 44, č. 247, s. 335–341. ISSN 0162-1459. Dostupné z: https://doi.org/10.1080/01621459.1949.10483310</w:t>
       </w:r>
     </w:p>
     <w:p>
@@ -782,151 +782,7 @@
           <w:sz w:val="24"/>
           <w:szCs w:val="24"/>
         </w:rPr>
-        <w:t xml:space="preserve">. 2014, roč. 40, č. 5, s. 94–107. ISSN 0095-4918.</w:t>
-      </w:r>
-    </w:p>
-    <w:p>
-      <w:pPr>
-        <w:tabs>
-          <w:tab w:val="left" w:pos="567"/>
-        </w:tabs>
-        <w:spacing w:after="200" w:line="300"/>
-        <w:ind w:left="567" w:hanging="567"/>
-        <w:jc w:val="both"/>
-      </w:pPr>
-      <w:r>
-        <w:rPr>
-          <w:rFonts w:ascii="Times New Roman" w:cs="Times New Roman" w:eastAsia="Times New Roman" w:hAnsi="Times New Roman"/>
-          <w:sz w:val="24"/>
-          <w:szCs w:val="24"/>
-        </w:rPr>
-        <w:t xml:space="preserve">(17)	</w:t>
-      </w:r>
-      <w:r>
-        <w:rPr>
-          <w:rFonts w:ascii="Times New Roman" w:cs="Times New Roman" w:eastAsia="Times New Roman" w:hAnsi="Times New Roman"/>
-          <w:i w:val="false"/>
-          <w:iCs w:val="false"/>
-          <w:sz w:val="24"/>
-          <w:szCs w:val="24"/>
-        </w:rPr>
-        <w:t xml:space="preserve">LÓPEZ DE PRADO, Marcos. </w:t>
-      </w:r>
-      <w:r>
-        <w:rPr>
-          <w:rFonts w:ascii="Times New Roman" w:cs="Times New Roman" w:eastAsia="Times New Roman" w:hAnsi="Times New Roman"/>
-          <w:i/>
-          <w:iCs/>
-          <w:sz w:val="24"/>
-          <w:szCs w:val="24"/>
-        </w:rPr>
-        <w:t xml:space="preserve">Advances in Financial Machine Learning</w:t>
-      </w:r>
-      <w:r>
-        <w:rPr>
-          <w:rFonts w:ascii="Times New Roman" w:cs="Times New Roman" w:eastAsia="Times New Roman" w:hAnsi="Times New Roman"/>
-          <w:i w:val="false"/>
-          <w:iCs w:val="false"/>
-          <w:sz w:val="24"/>
-          <w:szCs w:val="24"/>
-        </w:rPr>
-        <w:t xml:space="preserve">. Hoboken (NJ): John Wiley &amp; Sons, 2018. ISBN 978-1-119-48208-6.</w:t>
-      </w:r>
-    </w:p>
-    <w:p>
-      <w:pPr>
-        <w:tabs>
-          <w:tab w:val="left" w:pos="567"/>
-        </w:tabs>
-        <w:spacing w:after="200" w:line="300"/>
-        <w:ind w:left="567" w:hanging="567"/>
-        <w:jc w:val="both"/>
-      </w:pPr>
-      <w:r>
-        <w:rPr>
-          <w:rFonts w:ascii="Times New Roman" w:cs="Times New Roman" w:eastAsia="Times New Roman" w:hAnsi="Times New Roman"/>
-          <w:sz w:val="24"/>
-          <w:szCs w:val="24"/>
-        </w:rPr>
-        <w:t xml:space="preserve">(18)	</w:t>
-      </w:r>
-      <w:r>
-        <w:rPr>
-          <w:rFonts w:ascii="Times New Roman" w:cs="Times New Roman" w:eastAsia="Times New Roman" w:hAnsi="Times New Roman"/>
-          <w:i w:val="false"/>
-          <w:iCs w:val="false"/>
-          <w:sz w:val="24"/>
-          <w:szCs w:val="24"/>
-        </w:rPr>
-        <w:t xml:space="preserve">QuantConnect Corporation. </w:t>
-      </w:r>
-      <w:r>
-        <w:rPr>
-          <w:rFonts w:ascii="Times New Roman" w:cs="Times New Roman" w:eastAsia="Times New Roman" w:hAnsi="Times New Roman"/>
-          <w:i/>
-          <w:iCs/>
-          <w:sz w:val="24"/>
-          <w:szCs w:val="24"/>
-        </w:rPr>
-        <w:t xml:space="preserve">LEAN Algorithmic Trading Engine</w:t>
-      </w:r>
-      <w:r>
-        <w:rPr>
-          <w:rFonts w:ascii="Times New Roman" w:cs="Times New Roman" w:eastAsia="Times New Roman" w:hAnsi="Times New Roman"/>
-          <w:i w:val="false"/>
-          <w:iCs w:val="false"/>
-          <w:sz w:val="24"/>
-          <w:szCs w:val="24"/>
-        </w:rPr>
-        <w:t xml:space="preserve"> [software, online]. 2023 [cit. 2026-07-22]. Dostupné z: https://www.quantconnect.com</w:t>
-      </w:r>
-    </w:p>
-    <w:p>
-      <w:pPr>
-        <w:tabs>
-          <w:tab w:val="left" w:pos="567"/>
-        </w:tabs>
-        <w:spacing w:after="200" w:line="300"/>
-        <w:ind w:left="567" w:hanging="567"/>
-        <w:jc w:val="both"/>
-      </w:pPr>
-      <w:r>
-        <w:rPr>
-          <w:rFonts w:ascii="Times New Roman" w:cs="Times New Roman" w:eastAsia="Times New Roman" w:hAnsi="Times New Roman"/>
-          <w:sz w:val="24"/>
-          <w:szCs w:val="24"/>
-        </w:rPr>
-        <w:t xml:space="preserve">(19)	</w:t>
-      </w:r>
-      <w:r>
-        <w:rPr>
-          <w:rFonts w:ascii="Times New Roman" w:cs="Times New Roman" w:eastAsia="Times New Roman" w:hAnsi="Times New Roman"/>
-          <w:i w:val="false"/>
-          <w:iCs w:val="false"/>
-          <w:sz w:val="24"/>
-          <w:szCs w:val="24"/>
-        </w:rPr>
-        <w:t xml:space="preserve">TradingView. </w:t>
-      </w:r>
-      <w:r>
-        <w:rPr>
-          <w:rFonts w:ascii="Times New Roman" w:cs="Times New Roman" w:eastAsia="Times New Roman" w:hAnsi="Times New Roman"/>
-          <w:i/>
-          <w:iCs/>
-          <w:sz w:val="24"/>
-          <w:szCs w:val="24"/>
-        </w:rPr>
-        <w:t xml:space="preserve">Pine Script (verze 5)</w:t>
-      </w:r>
-      <w:r>
-        <w:rPr>
-          <w:rFonts w:ascii="Times New Roman" w:cs="Times New Roman" w:eastAsia="Times New Roman" w:hAnsi="Times New Roman"/>
-          <w:i w:val="false"/>
-          <w:iCs w:val="false"/>
-          <w:sz w:val="24"/>
-          <w:szCs w:val="24"/>
-        </w:rPr>
-        <w:t xml:space="preserve"> [software, online]. 2023 [cit. 2026-07-22]. Dostupné z: https://www.tradingview.com</w:t>
+        <w:t xml:space="preserve">. 2014, roč. 40, č. 5, s. 94–107. ISSN 0095-4918. Dostupné z: https://doi.org/10.3905/jpm.2014.40.5.094</w:t>
       </w:r>
     </w:p>
     <w:sectPr>

</xml_diff>

<commit_message>
docs: add Chapter 2 (Data a metodologie) model + sources 17-19
Chapter 2 methodology draft with parameters verified against the
strategy code (20 bps band, 25th/60th percentile gates, 250-day window,
0.4/1.2 bps round-turn costs). Extend reference list to 19
(QuantConnect/LEAN, TradingView, López de Prado 2018).

Co-Authored-By: Claude Opus 4.8 <noreply@anthropic.com>
Claude-Session: https://claude.ai/code/session_013r7ovPSZArf9XucUhV1eXv
</commit_message>
<xml_diff>
--- a/docs/Seznam_zdroju.docx
+++ b/docs/Seznam_zdroju.docx
@@ -783,6 +783,150 @@
           <w:szCs w:val="24"/>
         </w:rPr>
         <w:t xml:space="preserve">. 2014, roč. 40, č. 5, s. 94–107. ISSN 0095-4918. Dostupné z: https://doi.org/10.3905/jpm.2014.40.5.094</w:t>
+      </w:r>
+    </w:p>
+    <w:p>
+      <w:pPr>
+        <w:tabs>
+          <w:tab w:val="left" w:pos="567"/>
+        </w:tabs>
+        <w:spacing w:after="200" w:line="300"/>
+        <w:ind w:left="567" w:hanging="567"/>
+        <w:jc w:val="both"/>
+      </w:pPr>
+      <w:r>
+        <w:rPr>
+          <w:rFonts w:ascii="Times New Roman" w:cs="Times New Roman" w:eastAsia="Times New Roman" w:hAnsi="Times New Roman"/>
+          <w:sz w:val="24"/>
+          <w:szCs w:val="24"/>
+        </w:rPr>
+        <w:t xml:space="preserve">(17)	</w:t>
+      </w:r>
+      <w:r>
+        <w:rPr>
+          <w:rFonts w:ascii="Times New Roman" w:cs="Times New Roman" w:eastAsia="Times New Roman" w:hAnsi="Times New Roman"/>
+          <w:i w:val="false"/>
+          <w:iCs w:val="false"/>
+          <w:sz w:val="24"/>
+          <w:szCs w:val="24"/>
+        </w:rPr>
+        <w:t xml:space="preserve">QuantConnect Corporation. </w:t>
+      </w:r>
+      <w:r>
+        <w:rPr>
+          <w:rFonts w:ascii="Times New Roman" w:cs="Times New Roman" w:eastAsia="Times New Roman" w:hAnsi="Times New Roman"/>
+          <w:i/>
+          <w:iCs/>
+          <w:sz w:val="24"/>
+          <w:szCs w:val="24"/>
+        </w:rPr>
+        <w:t xml:space="preserve">LEAN Algorithmic Trading Engine</w:t>
+      </w:r>
+      <w:r>
+        <w:rPr>
+          <w:rFonts w:ascii="Times New Roman" w:cs="Times New Roman" w:eastAsia="Times New Roman" w:hAnsi="Times New Roman"/>
+          <w:i w:val="false"/>
+          <w:iCs w:val="false"/>
+          <w:sz w:val="24"/>
+          <w:szCs w:val="24"/>
+        </w:rPr>
+        <w:t xml:space="preserve"> [software, online]. 2023 [cit. 2026-07-22]. Dostupné z: https://www.quantconnect.com</w:t>
+      </w:r>
+    </w:p>
+    <w:p>
+      <w:pPr>
+        <w:tabs>
+          <w:tab w:val="left" w:pos="567"/>
+        </w:tabs>
+        <w:spacing w:after="200" w:line="300"/>
+        <w:ind w:left="567" w:hanging="567"/>
+        <w:jc w:val="both"/>
+      </w:pPr>
+      <w:r>
+        <w:rPr>
+          <w:rFonts w:ascii="Times New Roman" w:cs="Times New Roman" w:eastAsia="Times New Roman" w:hAnsi="Times New Roman"/>
+          <w:sz w:val="24"/>
+          <w:szCs w:val="24"/>
+        </w:rPr>
+        <w:t xml:space="preserve">(18)	</w:t>
+      </w:r>
+      <w:r>
+        <w:rPr>
+          <w:rFonts w:ascii="Times New Roman" w:cs="Times New Roman" w:eastAsia="Times New Roman" w:hAnsi="Times New Roman"/>
+          <w:i w:val="false"/>
+          <w:iCs w:val="false"/>
+          <w:sz w:val="24"/>
+          <w:szCs w:val="24"/>
+        </w:rPr>
+        <w:t xml:space="preserve">TradingView. </w:t>
+      </w:r>
+      <w:r>
+        <w:rPr>
+          <w:rFonts w:ascii="Times New Roman" w:cs="Times New Roman" w:eastAsia="Times New Roman" w:hAnsi="Times New Roman"/>
+          <w:i/>
+          <w:iCs/>
+          <w:sz w:val="24"/>
+          <w:szCs w:val="24"/>
+        </w:rPr>
+        <w:t xml:space="preserve">Pine Script (verze 5)</w:t>
+      </w:r>
+      <w:r>
+        <w:rPr>
+          <w:rFonts w:ascii="Times New Roman" w:cs="Times New Roman" w:eastAsia="Times New Roman" w:hAnsi="Times New Roman"/>
+          <w:i w:val="false"/>
+          <w:iCs w:val="false"/>
+          <w:sz w:val="24"/>
+          <w:szCs w:val="24"/>
+        </w:rPr>
+        <w:t xml:space="preserve"> [software, online]. 2023 [cit. 2026-07-22]. Dostupné z: https://www.tradingview.com</w:t>
+      </w:r>
+    </w:p>
+    <w:p>
+      <w:pPr>
+        <w:tabs>
+          <w:tab w:val="left" w:pos="567"/>
+        </w:tabs>
+        <w:spacing w:after="200" w:line="300"/>
+        <w:ind w:left="567" w:hanging="567"/>
+        <w:jc w:val="both"/>
+      </w:pPr>
+      <w:r>
+        <w:rPr>
+          <w:rFonts w:ascii="Times New Roman" w:cs="Times New Roman" w:eastAsia="Times New Roman" w:hAnsi="Times New Roman"/>
+          <w:sz w:val="24"/>
+          <w:szCs w:val="24"/>
+        </w:rPr>
+        <w:t xml:space="preserve">(19)	</w:t>
+      </w:r>
+      <w:r>
+        <w:rPr>
+          <w:rFonts w:ascii="Times New Roman" w:cs="Times New Roman" w:eastAsia="Times New Roman" w:hAnsi="Times New Roman"/>
+          <w:i w:val="false"/>
+          <w:iCs w:val="false"/>
+          <w:sz w:val="24"/>
+          <w:szCs w:val="24"/>
+        </w:rPr>
+        <w:t xml:space="preserve">LÓPEZ DE PRADO, Marcos. </w:t>
+      </w:r>
+      <w:r>
+        <w:rPr>
+          <w:rFonts w:ascii="Times New Roman" w:cs="Times New Roman" w:eastAsia="Times New Roman" w:hAnsi="Times New Roman"/>
+          <w:i/>
+          <w:iCs/>
+          <w:sz w:val="24"/>
+          <w:szCs w:val="24"/>
+        </w:rPr>
+        <w:t xml:space="preserve">Advances in Financial Machine Learning</w:t>
+      </w:r>
+      <w:r>
+        <w:rPr>
+          <w:rFonts w:ascii="Times New Roman" w:cs="Times New Roman" w:eastAsia="Times New Roman" w:hAnsi="Times New Roman"/>
+          <w:i w:val="false"/>
+          <w:iCs w:val="false"/>
+          <w:sz w:val="24"/>
+          <w:szCs w:val="24"/>
+        </w:rPr>
+        <w:t xml:space="preserve">. Hoboken (NJ): John Wiley &amp; Sons, 2018, s. [doplň stranu]. ISBN 978-1-119-48208-6. Dostupné z: https://books.google.com/books?isbn=9781119482086</w:t>
       </w:r>
     </w:p>
     <w:sectPr>

</xml_diff>